<commit_message>
Add PDFs and update Tema_05 resources
Add PDF exports for Firestore-MongoDB, Manual_Java_Mongo_MSB and RTDB-MSB and update their .docx sources. Also update generated Maven pom.properties in Tema_05 target: bump timestamp and change m2e.projectLocation to a Windows path.
</commit_message>
<xml_diff>
--- a/Acceso_Datos/Tema_5/Firestore-MongoDB.docx
+++ b/Acceso_Datos/Tema_5/Firestore-MongoDB.docx
@@ -184,7 +184,7 @@
                 <v:stroke joinstyle="miter"/>
                 <v:path gradientshapeok="t" o:connecttype="rect"/>
               </v:shapetype>
-              <v:shape id="Text Box 3" o:spid="_x0000_s1026" type="#_x0000_t202" style="position:absolute;left:0;text-align:left;margin-left:-39.4pt;margin-top:267.7pt;width:243.6pt;height:223.9pt;z-index:251660288;visibility:visible;mso-wrap-style:square;mso-width-percent:0;mso-height-percent:0;mso-wrap-distance-left:9pt;mso-wrap-distance-top:0;mso-wrap-distance-right:9pt;mso-wrap-distance-bottom:0;mso-position-horizontal:absolute;mso-position-horizontal-relative:text;mso-position-vertical:absolute;mso-position-vertical-relative:text;mso-width-percent:0;mso-height-percent:0;mso-width-relative:margin;mso-height-relative:margin;v-text-anchor:top" o:gfxdata="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" filled="f" stroked="f" strokeweight=".5pt">
+              <v:shape id="Text Box 3" o:spid="_x0000_s1026" type="#_x0000_t202" style="position:absolute;left:0;text-align:left;margin-left:-39.4pt;margin-top:267.7pt;width:243.6pt;height:223.9pt;z-index:251660288;visibility:visible;mso-wrap-style:square;mso-width-percent:0;mso-height-percent:0;mso-wrap-distance-left:9pt;mso-wrap-distance-top:0;mso-wrap-distance-right:9pt;mso-wrap-distance-bottom:0;mso-position-horizontal:absolute;mso-position-horizontal-relative:text;mso-position-vertical:absolute;mso-position-vertical-relative:text;mso-width-percent:0;mso-height-percent:0;mso-width-relative:margin;mso-height-relative:margin;v-text-anchor:top" o:gfxdata="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" filled="f" stroked="f" strokeweight=".5pt">
                 <v:textbox>
                   <w:txbxContent>
                     <w:p>
@@ -340,7 +340,7 @@
                   <v:h position="#0,topLeft" xrange="0,21600"/>
                 </v:handles>
               </v:shapetype>
-              <v:shape id="Isosceles Triangle 5" o:spid="_x0000_s1026" type="#_x0000_t5" style="position:absolute;margin-left:-94.05pt;margin-top:674.65pt;width:115.9pt;height:99.9pt;z-index:-251653120;visibility:visible;mso-wrap-style:square;mso-width-percent:0;mso-height-percent:0;mso-wrap-distance-left:9pt;mso-wrap-distance-top:0;mso-wrap-distance-right:9pt;mso-wrap-distance-bottom:0;mso-position-horizontal:absolute;mso-position-horizontal-relative:text;mso-position-vertical:absolute;mso-position-vertical-relative:text;mso-width-percent:0;mso-height-percent:0;mso-width-relative:margin;mso-height-relative:margin;v-text-anchor:middle" o:gfxdata="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" adj="0" fillcolor="#00c" stroked="f" strokeweight="1pt"/>
+              <v:shape id="Isosceles Triangle 5" o:spid="_x0000_s1026" type="#_x0000_t5" style="position:absolute;margin-left:-94.05pt;margin-top:674.65pt;width:115.9pt;height:99.9pt;z-index:-251653120;visibility:visible;mso-wrap-style:square;mso-width-percent:0;mso-height-percent:0;mso-wrap-distance-left:9pt;mso-wrap-distance-top:0;mso-wrap-distance-right:9pt;mso-wrap-distance-bottom:0;mso-position-horizontal:absolute;mso-position-horizontal-relative:text;mso-position-vertical:absolute;mso-position-vertical-relative:text;mso-width-percent:0;mso-height-percent:0;mso-width-relative:margin;mso-height-relative:margin;v-text-anchor:middle" o:gfxdata="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" adj="0" fillcolor="#00c" stroked="f" strokeweight="1pt"/>
             </w:pict>
           </mc:Fallback>
         </mc:AlternateContent>
@@ -442,7 +442,7 @@
                   <v:h position="#0,topLeft" xrange="0,21600"/>
                 </v:handles>
               </v:shapetype>
-              <v:shape id="Parallelogram 4" o:spid="_x0000_s1026" type="#_x0000_t7" style="position:absolute;margin-left:-38.8pt;margin-top:611.35pt;width:286.35pt;height:7.5pt;z-index:251662336;visibility:visible;mso-wrap-style:square;mso-width-percent:0;mso-height-percent:0;mso-wrap-distance-left:9pt;mso-wrap-distance-top:0;mso-wrap-distance-right:9pt;mso-wrap-distance-bottom:0;mso-position-horizontal:absolute;mso-position-horizontal-relative:text;mso-position-vertical:absolute;mso-position-vertical-relative:text;mso-width-percent:0;mso-height-percent:0;mso-width-relative:margin;mso-height-relative:margin;v-text-anchor:middle" o:gfxdata="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" adj="141" fillcolor="#0b1023" stroked="f" strokeweight="1pt"/>
+              <v:shape id="Parallelogram 4" o:spid="_x0000_s1026" type="#_x0000_t7" style="position:absolute;margin-left:-38.8pt;margin-top:611.35pt;width:286.35pt;height:7.5pt;z-index:251662336;visibility:visible;mso-wrap-style:square;mso-width-percent:0;mso-height-percent:0;mso-wrap-distance-left:9pt;mso-wrap-distance-top:0;mso-wrap-distance-right:9pt;mso-wrap-distance-bottom:0;mso-position-horizontal:absolute;mso-position-horizontal-relative:text;mso-position-vertical:absolute;mso-position-vertical-relative:text;mso-width-percent:0;mso-height-percent:0;mso-width-relative:margin;mso-height-relative:margin;v-text-anchor:middle" o:gfxdata="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" adj="141" fillcolor="#0b1023" stroked="f" strokeweight="1pt"/>
             </w:pict>
           </mc:Fallback>
         </mc:AlternateContent>
@@ -589,7 +589,7 @@
           </mc:Choice>
           <mc:Fallback>
             <w:pict>
-              <v:shape w14:anchorId="60FEB9E6" id="_x0000_s1027" type="#_x0000_t202" style="position:absolute;left:0;text-align:left;margin-left:-39.1pt;margin-top:494.95pt;width:299.15pt;height:98.05pt;z-index:251661312;visibility:visible;mso-wrap-style:square;mso-width-percent:0;mso-height-percent:0;mso-wrap-distance-left:9pt;mso-wrap-distance-top:0;mso-wrap-distance-right:9pt;mso-wrap-distance-bottom:0;mso-position-horizontal:absolute;mso-position-horizontal-relative:text;mso-position-vertical:absolute;mso-position-vertical-relative:text;mso-width-percent:0;mso-height-percent:0;mso-width-relative:margin;mso-height-relative:margin;v-text-anchor:top" o:gfxdata="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" filled="f" stroked="f" strokeweight=".5pt">
+              <v:shape w14:anchorId="60FEB9E6" id="_x0000_s1027" type="#_x0000_t202" style="position:absolute;left:0;text-align:left;margin-left:-39.1pt;margin-top:494.95pt;width:299.15pt;height:98.05pt;z-index:251661312;visibility:visible;mso-wrap-style:square;mso-width-percent:0;mso-height-percent:0;mso-wrap-distance-left:9pt;mso-wrap-distance-top:0;mso-wrap-distance-right:9pt;mso-wrap-distance-bottom:0;mso-position-horizontal:absolute;mso-position-horizontal-relative:text;mso-position-vertical:absolute;mso-position-vertical-relative:text;mso-width-percent:0;mso-height-percent:0;mso-width-relative:margin;mso-height-relative:margin;v-text-anchor:top" o:gfxdata="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" filled="f" stroked="f" strokeweight=".5pt">
                 <v:textbox>
                   <w:txbxContent>
                     <w:p>
@@ -1187,7 +1187,7 @@
                 <w:noProof/>
                 <w:webHidden/>
               </w:rPr>
-              <w:t>9</w:t>
+              <w:t>10</w:t>
             </w:r>
             <w:r>
               <w:rPr>
@@ -1790,7 +1790,7 @@
           <w:noProof/>
         </w:rPr>
         <w:drawing>
-          <wp:inline distT="0" distB="0" distL="0" distR="0">
+          <wp:inline distT="0" distB="0" distL="0" distR="0" wp14:anchorId="208F2AC0" wp14:editId="2F67D634">
             <wp:extent cx="4914900" cy="3098800"/>
             <wp:effectExtent l="0" t="0" r="0" b="0"/>
             <wp:docPr id="820880773" name="Imagen 1" descr="Diagrama&#10;&#10;El contenido generado por IA puede ser incorrecto."/>
@@ -1866,7 +1866,7 @@
           <w:noProof/>
         </w:rPr>
         <w:drawing>
-          <wp:inline distT="0" distB="0" distL="0" distR="0">
+          <wp:inline distT="0" distB="0" distL="0" distR="0" wp14:anchorId="3D91432F" wp14:editId="08CB480E">
             <wp:extent cx="4318000" cy="4584700"/>
             <wp:effectExtent l="0" t="0" r="0" b="0"/>
             <wp:docPr id="1250816568" name="Imagen 2" descr="Imagen que contiene Tabla&#10;&#10;El contenido generado por IA puede ser incorrecto."/>
@@ -1913,13 +1913,8 @@
         <w:pStyle w:val="Ttulo2"/>
       </w:pPr>
       <w:bookmarkStart w:id="3" w:name="_Toc221705190"/>
-      <w:proofErr w:type="spellStart"/>
-      <w:r>
-        <w:t>String</w:t>
-      </w:r>
-      <w:proofErr w:type="spellEnd"/>
-      <w:r>
-        <w:t xml:space="preserve"> de conexión</w:t>
+      <w:r>
+        <w:t>String de conexión</w:t>
       </w:r>
       <w:bookmarkEnd w:id="3"/>
     </w:p>
@@ -1948,14 +1943,9 @@
       <w:bookmarkStart w:id="4" w:name="_Toc221705191"/>
       <w:r>
         <w:lastRenderedPageBreak/>
-        <w:t xml:space="preserve">MongoDB </w:t>
-      </w:r>
-      <w:proofErr w:type="spellStart"/>
-      <w:r>
-        <w:t>Compass</w:t>
+        <w:t>MongoDB Compass</w:t>
       </w:r>
       <w:bookmarkEnd w:id="4"/>
-      <w:proofErr w:type="spellEnd"/>
     </w:p>
     <w:p>
       <w:r>
@@ -2112,6 +2102,7 @@
       </w:pPr>
       <w:bookmarkStart w:id="5" w:name="_Toc221705192"/>
       <w:r>
+        <w:lastRenderedPageBreak/>
         <w:t>Script CRUD</w:t>
       </w:r>
       <w:bookmarkEnd w:id="5"/>
@@ -2195,7 +2186,15 @@
       </w:r>
       <w:proofErr w:type="spellEnd"/>
       <w:r>
-        <w:t xml:space="preserve"> CARGA DE DATOS (VERSION FIRESTORE COMPATIBLE)...");</w:t>
+        <w:t xml:space="preserve"> CARGA DE DATOS (VERSION FIRESTORE </w:t>
+      </w:r>
+      <w:proofErr w:type="gramStart"/>
+      <w:r>
+        <w:t>COMPATIBLE)...</w:t>
+      </w:r>
+      <w:proofErr w:type="gramEnd"/>
+      <w:r>
+        <w:t>");</w:t>
       </w:r>
     </w:p>
     <w:p>
@@ -2203,10 +2202,7 @@
         <w:jc w:val="left"/>
       </w:pPr>
       <w:r>
-        <w:t>/</w:t>
-      </w:r>
-      <w:r>
-        <w:t>/ LIMPIEZA</w:t>
+        <w:t>// LIMPIEZA</w:t>
       </w:r>
     </w:p>
     <w:p>
@@ -2383,15 +2379,7 @@
       </w:r>
       <w:proofErr w:type="gramEnd"/>
       <w:r>
-        <w:t xml:space="preserve">nombre": "Laptop </w:t>
-      </w:r>
-      <w:proofErr w:type="spellStart"/>
-      <w:r>
-        <w:t>Gamer</w:t>
-      </w:r>
-      <w:proofErr w:type="spellEnd"/>
-      <w:r>
-        <w:t>", "precio": 1200.00, "stock": 10, "</w:t>
+        <w:t>nombre": "Laptop Gamer", "precio": 1200.00, "stock": 10, "</w:t>
       </w:r>
       <w:proofErr w:type="spellStart"/>
       <w:r>
@@ -2399,13 +2387,8 @@
       </w:r>
       <w:proofErr w:type="spellEnd"/>
       <w:r>
-        <w:t>": "</w:t>
-      </w:r>
-      <w:proofErr w:type="spellStart"/>
-      <w:r>
-        <w:t>Tech</w:t>
-      </w:r>
-      <w:proofErr w:type="spellEnd"/>
+        <w:t>": "Tech</w:t>
+      </w:r>
       <w:proofErr w:type="gramStart"/>
       <w:r>
         <w:t>" }</w:t>
@@ -2508,13 +2491,8 @@
       </w:r>
       <w:proofErr w:type="spellEnd"/>
       <w:r>
-        <w:t>": "</w:t>
-      </w:r>
-      <w:proofErr w:type="spellStart"/>
-      <w:r>
-        <w:t>Tech</w:t>
-      </w:r>
-      <w:proofErr w:type="spellEnd"/>
+        <w:t>": "Tech</w:t>
+      </w:r>
       <w:proofErr w:type="gramStart"/>
       <w:r>
         <w:t>" }</w:t>
@@ -3302,7 +3280,7 @@
                     <v:h position="#0,topLeft" xrange="0,21600"/>
                   </v:handles>
                 </v:shapetype>
-                <v:shape id="Isosceles Triangle 5" o:spid="_x0000_s1026" type="#_x0000_t5" style="position:absolute;margin-left:0;margin-top:-6.1pt;width:84.95pt;height:70.5pt;flip:x;z-index:-251657216;visibility:visible;mso-wrap-style:square;mso-width-percent:0;mso-height-percent:0;mso-wrap-distance-left:9pt;mso-wrap-distance-top:0;mso-wrap-distance-right:9pt;mso-wrap-distance-bottom:0;mso-position-horizontal:absolute;mso-position-horizontal-relative:right-margin-area;mso-position-vertical:absolute;mso-position-vertical-relative:text;mso-width-percent:0;mso-height-percent:0;mso-width-relative:margin;mso-height-relative:margin;v-text-anchor:middle" o:gfxdata="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" adj="0" fillcolor="#00c" stroked="f" strokeweight="1pt">
+                <v:shape id="Isosceles Triangle 5" o:spid="_x0000_s1026" type="#_x0000_t5" style="position:absolute;margin-left:0;margin-top:-6.1pt;width:84.95pt;height:70.5pt;flip:x;z-index:-251657216;visibility:visible;mso-wrap-style:square;mso-width-percent:0;mso-height-percent:0;mso-wrap-distance-left:9pt;mso-wrap-distance-top:0;mso-wrap-distance-right:9pt;mso-wrap-distance-bottom:0;mso-position-horizontal:absolute;mso-position-horizontal-relative:right-margin-area;mso-position-vertical:absolute;mso-position-vertical-relative:text;mso-width-percent:0;mso-height-percent:0;mso-width-relative:margin;mso-height-relative:margin;v-text-anchor:middle" o:gfxdata="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" adj="0" fillcolor="#00c" stroked="f" strokeweight="1pt">
                   <w10:wrap anchorx="margin"/>
                 </v:shape>
               </w:pict>

</xml_diff>